<commit_message>
Actualizar Indicador 6 con fuentes SIIS + EPH-INDEC, eliminar RSH y agregar Gráfico de Ingreso Promedio del Hogar
</commit_message>
<xml_diff>
--- a/Tabla_Indicadores_Indigencia_0_17_v6.docx
+++ b/Tabla_Indicadores_Indigencia_0_17_v6.docx
@@ -252,10 +252,7 @@
           </w:p>
           <w:p>
             <w:r>
-              <w:t>no contributivas</w:t>
-            </w:r>
-            <w:r>
-              <w:t xml:space="preserve"> (AUH, AAFF,</w:t>
+              <w:t>no contributivas (AUH, AAFF,</w:t>
             </w:r>
           </w:p>
           <w:p>
@@ -326,10 +323,7 @@
           </w:p>
           <w:p>
             <w:r>
-              <w:t>en padrón ANS</w:t>
-            </w:r>
-            <w:r>
-              <w:t>ES) × 100</w:t>
+              <w:t>en padrón ANSES) × 100</w:t>
             </w:r>
           </w:p>
           <w:p/>
@@ -661,10 +655,7 @@
           </w:p>
           <w:p>
             <w:r>
-              <w:t>• N.º niños/adolescentes 0-17</w:t>
-            </w:r>
-            <w:r>
-              <w:t xml:space="preserve"> con</w:t>
+              <w:t>• N.º niños/adolescentes 0-17 con</w:t>
             </w:r>
           </w:p>
           <w:p>
@@ -721,10 +712,7 @@
           </w:p>
           <w:p>
             <w:r>
-              <w:t xml:space="preserve">• </w:t>
-            </w:r>
-            <w:r>
-              <w:t>Aumento de altas sin libreta</w:t>
+              <w:t>• Aumento de altas sin libreta</w:t>
             </w:r>
           </w:p>
           <w:p>
@@ -792,10 +780,7 @@
           </w:p>
           <w:p>
             <w:r>
-              <w:t>de 0 a 17 años</w:t>
-            </w:r>
-            <w:r>
-              <w:t xml:space="preserve"> en hogares con</w:t>
+              <w:t>de 0 a 17 años en hogares con</w:t>
             </w:r>
           </w:p>
           <w:p>
@@ -861,10 +846,7 @@
           </w:p>
           <w:p>
             <w:r>
-              <w:t>Alimentar 0-17 / T</w:t>
-            </w:r>
-            <w:r>
-              <w:t>otal 0-17</w:t>
+              <w:t>Alimentar 0-17 / Total 0-17</w:t>
             </w:r>
           </w:p>
           <w:p>
@@ -922,10 +904,7 @@
           </w:p>
           <w:p>
             <w:r>
-              <w:t xml:space="preserve">Cobertura </w:t>
-            </w:r>
-            <w:r>
-              <w:t>Alimentar + densidad</w:t>
+              <w:t>Cobertura Alimentar + densidad</w:t>
             </w:r>
           </w:p>
           <w:p>
@@ -1001,10 +980,7 @@
           <w:p/>
           <w:p>
             <w:r>
-              <w:t xml:space="preserve">Fuente </w:t>
-            </w:r>
-            <w:r>
-              <w:t>complementaria:</w:t>
+              <w:t>Fuente complementaria:</w:t>
             </w:r>
           </w:p>
           <w:p>
@@ -1156,10 +1132,7 @@
           </w:p>
           <w:p>
             <w:r>
-              <w:t>• Prenatal</w:t>
-            </w:r>
-            <w:r>
-              <w:t xml:space="preserve"> / postnatal (campo:</w:t>
+              <w:t>• Prenatal / postnatal (campo:</w:t>
             </w:r>
           </w:p>
           <w:p>
@@ -1232,10 +1205,7 @@
           </w:p>
           <w:p>
             <w:r>
-              <w:t>• Mo</w:t>
-            </w:r>
-            <w:r>
-              <w:t>nto promedio por titular</w:t>
+              <w:t>• Monto promedio por titular</w:t>
             </w:r>
           </w:p>
           <w:p>
@@ -1487,10 +1457,7 @@
           </w:p>
           <w:p>
             <w:r>
-              <w:t>Flia_Numerosa y Disca</w:t>
-            </w:r>
-            <w:r>
-              <w:t>pacitado</w:t>
+              <w:t>Flia_Numerosa y Discapacitado</w:t>
             </w:r>
           </w:p>
         </w:tc>
@@ -1563,10 +1530,7 @@
           <w:p/>
           <w:p>
             <w:r>
-              <w:t xml:space="preserve">Fuente </w:t>
-            </w:r>
-            <w:r>
-              <w:t>complementaria:</w:t>
+              <w:t>Fuente complementaria:</w:t>
             </w:r>
           </w:p>
           <w:p>
@@ -1717,10 +1681,7 @@
           </w:p>
           <w:p>
             <w:r>
-              <w:t xml:space="preserve">• Tipo de </w:t>
-            </w:r>
-            <w:r>
-              <w:t>subsidio: luz / gas /</w:t>
+              <w:t>• Tipo de subsidio: luz / gas /</w:t>
             </w:r>
           </w:p>
           <w:p>
@@ -1765,10 +1726,7 @@
           </w:p>
           <w:p>
             <w:r>
-              <w:t>• Estado de la solicitu</w:t>
-            </w:r>
-            <w:r>
-              <w:t>d</w:t>
+              <w:t>• Estado de la solicitud</w:t>
             </w:r>
           </w:p>
           <w:p>
@@ -1850,13 +1808,7 @@
               <w:rPr>
                 <w:b/>
               </w:rPr>
-              <w:t>Alertas suge</w:t>
-            </w:r>
-            <w:r>
-              <w:rPr>
-                <w:b/>
-              </w:rPr>
-              <w:t>ridas:</w:t>
+              <w:t>Alertas sugeridas:</w:t>
             </w:r>
           </w:p>
           <w:p>
@@ -1912,10 +1864,7 @@
           </w:p>
           <w:p>
             <w:r>
-              <w:t xml:space="preserve">• Semáforo </w:t>
-            </w:r>
-            <w:r>
-              <w:t>cobertura por</w:t>
+              <w:t>• Semáforo cobertura por</w:t>
             </w:r>
           </w:p>
           <w:p>
@@ -2065,10 +2014,7 @@
           <w:p/>
           <w:p>
             <w:r>
-              <w:t>Tasa de</w:t>
-            </w:r>
-            <w:r>
-              <w:t xml:space="preserve"> cobertura educativa</w:t>
+              <w:t>Tasa de cobertura educativa</w:t>
             </w:r>
           </w:p>
           <w:p>
@@ -2133,10 +2079,7 @@
           </w:p>
           <w:p>
             <w:r>
-              <w:t xml:space="preserve">sublinea_beca, </w:t>
-            </w:r>
-            <w:r>
-              <w:t>monto_liquidado,</w:t>
+              <w:t>sublinea_beca, monto_liquidado,</w:t>
             </w:r>
           </w:p>
           <w:p>
@@ -2188,10 +2131,7 @@
           </w:p>
           <w:p>
             <w:r>
-              <w:t>sublinea_beca, monto_l</w:t>
-            </w:r>
-            <w:r>
-              <w:t>iquidado,</w:t>
+              <w:t>sublinea_beca, monto_liquidado,</w:t>
             </w:r>
           </w:p>
           <w:p>
@@ -2294,10 +2234,7 @@
           </w:p>
           <w:p>
             <w:r>
-              <w:t xml:space="preserve">• Tramo </w:t>
-            </w:r>
-            <w:r>
-              <w:t>etario (a partir de</w:t>
+              <w:t>• Tramo etario (a partir de</w:t>
             </w:r>
           </w:p>
           <w:p>
@@ -2347,10 +2284,7 @@
           </w:p>
           <w:p>
             <w:r>
-              <w:t xml:space="preserve">   (cant</w:t>
-            </w:r>
-            <w:r>
-              <w:t>_materias_avanzados)</w:t>
+              <w:t xml:space="preserve">   (cant_materias_avanzados)</w:t>
             </w:r>
           </w:p>
           <w:p>
@@ -2421,10 +2355,7 @@
           </w:p>
           <w:p>
             <w:r>
-              <w:t xml:space="preserve">• </w:t>
-            </w:r>
-            <w:r>
-              <w:t>Distribución por sublínea de</w:t>
+              <w:t>• Distribución por sublínea de</w:t>
             </w:r>
           </w:p>
           <w:p>
@@ -2482,10 +2413,7 @@
           </w:p>
           <w:p>
             <w:r>
-              <w:t>• Barras por sublí</w:t>
-            </w:r>
-            <w:r>
-              <w:t>nea (Alimentos,</w:t>
+              <w:t>• Barras por sublínea (Alimentos,</w:t>
             </w:r>
           </w:p>
           <w:p>
@@ -2697,10 +2625,7 @@
           </w:p>
           <w:p>
             <w:r>
-              <w:t>id_person</w:t>
-            </w:r>
-            <w:r>
-              <w:t>a_jurisdiccional,</w:t>
+              <w:t>id_persona_jurisdiccional,</w:t>
             </w:r>
           </w:p>
           <w:p>
@@ -2847,10 +2772,7 @@
           </w:p>
           <w:p>
             <w:r>
-              <w:t xml:space="preserve">   c_localidad_resi</w:t>
-            </w:r>
-            <w:r>
-              <w:t>dencia)</w:t>
+              <w:t xml:space="preserve">   c_localidad_residencia)</w:t>
             </w:r>
           </w:p>
           <w:p>
@@ -3112,15 +3034,7 @@
                 <w:color w:val="262626"/>
                 <w:sz w:val="16"/>
               </w:rPr>
-              <w:t xml:space="preserve">Capacidad </w:t>
-            </w:r>
-            <w:r>
-              <w:rPr>
-                <w:rFonts w:ascii="Arial" w:hAnsi="Arial"/>
-                <w:color w:val="262626"/>
-                <w:sz w:val="16"/>
-              </w:rPr>
-              <w:t>potencial de generación de ingresos (CPGI) / Vulnerabilidad estructural del hogar</w:t>
+              <w:t>Capacidad potencial de generación de ingresos (CPGI) / Vulnerabilidad estructural del hogar</w:t>
             </w:r>
           </w:p>
         </w:tc>
@@ -3140,7 +3054,7 @@
                 <w:color w:val="1F3864"/>
                 <w:sz w:val="16"/>
               </w:rPr>
-              <w:t>Modelo predictivo CPGI (MCO + Lasso):</w:t>
+              <w:t>Modelo predictivo CPGI:</w:t>
             </w:r>
           </w:p>
           <w:p>
@@ -3153,15 +3067,7 @@
                 <w:color w:val="262626"/>
                 <w:sz w:val="16"/>
               </w:rPr>
-              <w:t>ln(CPGI) = β₀ + β₁·(Cant_personas) + β₂·(Jefa_mujer_menores) + β₃·(Jubilados_pensionados) + β₄·(Saneamiento_deficiente) + β₅·(Tenencia_r</w:t>
-            </w:r>
-            <w:r>
-              <w:rPr>
-                <w:rFonts w:ascii="Arial" w:hAnsi="Arial"/>
-                <w:color w:val="262626"/>
-                <w:sz w:val="16"/>
-              </w:rPr>
-              <w:t>egular) + β₆·(Tasa_dependencia) + β₇·(Tasa_menores) + β₈·(Piso_precario) + β₉·(Techo_precario) + β₁₀·(Asalariados_registrados) + β₁₁·(Clima_educativo²) + β₁₂·(Jefe_superior_completo) + β₁₃·(Edad_jefe) + β₁₄·(Ingreso_real_medio_provincial)</w:t>
+              <w:t>ln(CPGI) = β₀ + β₁·(Cant_personas) + β₂·(Jefa_mujer_menores) + β₃·(Jubilados_pensionados) + β₄·(Saneamiento_deficiente) + β₅·(Tenencia_regular) + β₆·(Tasa_dependencia) + β₇·(Tasa_menores) + β₈·(Piso_precario) + β₉·(Techo_precario) + β₁₀·(Asalariados_registrados) + β₁₁·(Clima_educativo²) + β₁₂·(Jefe_superior_completo) + β₁₃·(Edad_jefe) + β₁₄·(Ingreso_real_medio_provincial)</w:t>
             </w:r>
           </w:p>
           <w:p>
@@ -3180,16 +3086,7 @@
                 <w:color w:val="1F3864"/>
                 <w:sz w:val="16"/>
               </w:rPr>
-              <w:t>Clasificación bi</w:t>
-            </w:r>
-            <w:r>
-              <w:rPr>
-                <w:rFonts w:ascii="Arial" w:hAnsi="Arial"/>
-                <w:b/>
-                <w:color w:val="1F3864"/>
-                <w:sz w:val="16"/>
-              </w:rPr>
-              <w:t>naria:</w:t>
+              <w:t>Clasificación binaria:</w:t>
             </w:r>
           </w:p>
           <w:p>
@@ -3267,25 +3164,7 @@
                 <w:color w:val="1F3864"/>
                 <w:sz w:val="16"/>
               </w:rPr>
-              <w:t xml:space="preserve">Fuentes principales </w:t>
-            </w:r>
-            <w:r>
-              <w:rPr>
-                <w:rFonts w:ascii="Arial" w:hAnsi="Arial"/>
-                <w:b/>
-                <w:color w:val="1F3864"/>
-                <w:sz w:val="16"/>
-              </w:rPr>
-              <w:t>integradas (</w:t>
-            </w:r>
-            <w:r>
-              <w:rPr>
-                <w:rFonts w:ascii="Arial" w:hAnsi="Arial"/>
-                <w:b/>
-                <w:color w:val="1F3864"/>
-                <w:sz w:val="16"/>
-              </w:rPr>
-              <w:t>SIIS):</w:t>
+              <w:t>Fuentes principales integradas (SIIS):</w:t>
             </w:r>
           </w:p>
           <w:p>
@@ -3298,46 +3177,20 @@
                 <w:color w:val="262626"/>
                 <w:sz w:val="16"/>
               </w:rPr>
-              <w:t>• Compo</w:t>
-            </w:r>
+              <w:t>• Composición familiar, vínculo de parentesco, características habitacionales y saneamiento.</w:t>
+            </w:r>
+          </w:p>
+          <w:p>
+            <w:pPr>
+              <w:spacing w:before="20" w:after="40" w:line="252" w:lineRule="auto"/>
+            </w:pPr>
             <w:r>
               <w:rPr>
                 <w:rFonts w:ascii="Arial" w:hAnsi="Arial"/>
                 <w:color w:val="262626"/>
                 <w:sz w:val="16"/>
               </w:rPr>
-              <w:t>sición familiar, vínculo de parentesco, características habitacionales y saneamiento</w:t>
-            </w:r>
-            <w:bookmarkStart w:id="0" w:name="_GoBack"/>
-            <w:bookmarkEnd w:id="0"/>
-            <w:r>
-              <w:rPr>
-                <w:rFonts w:ascii="Arial" w:hAnsi="Arial"/>
-                <w:color w:val="262626"/>
-                <w:sz w:val="16"/>
-              </w:rPr>
-              <w:t>.</w:t>
-            </w:r>
-          </w:p>
-          <w:p>
-            <w:pPr>
-              <w:spacing w:before="20" w:after="40" w:line="252" w:lineRule="auto"/>
-            </w:pPr>
-            <w:r>
-              <w:rPr>
-                <w:rFonts w:ascii="Arial" w:hAnsi="Arial"/>
-                <w:color w:val="262626"/>
-                <w:sz w:val="16"/>
-              </w:rPr>
-              <w:t>• EPH-INDEC (pool 2016-2024 / test 2025): base de entrenamiento del modelo CPGI y valorización de canast</w:t>
-            </w:r>
-            <w:r>
-              <w:rPr>
-                <w:rFonts w:ascii="Arial" w:hAnsi="Arial"/>
-                <w:color w:val="262626"/>
-                <w:sz w:val="16"/>
-              </w:rPr>
-              <w:t>as básicas (CBT/CBA) regionalizadas.</w:t>
+              <w:t>• EPH-INDEC (pool 2016-2024 / test 2025): base de entrenamiento del modelo CPGI y valorización de canastas básicas (CBT/CBA) regionalizadas.</w:t>
             </w:r>
           </w:p>
           <w:p>
@@ -3382,15 +3235,7 @@
                 <w:color w:val="262626"/>
                 <w:sz w:val="16"/>
               </w:rPr>
-              <w:t xml:space="preserve">• ARCA / STESS: </w:t>
-            </w:r>
-            <w:r>
-              <w:rPr>
-                <w:rFonts w:ascii="Arial" w:hAnsi="Arial"/>
-                <w:color w:val="262626"/>
-                <w:sz w:val="16"/>
-              </w:rPr>
-              <w:t>MECTRA, Autónomos, Monotributo, Casas Particulares y empleo registrado para identificar asalariados formales.</w:t>
+              <w:t>• ARCA / STESS: MECTRA, Autónomos, Monotributo, Casas Particulares y empleo registrado para identificar asalariados formales.</w:t>
             </w:r>
           </w:p>
           <w:p>
@@ -3436,16 +3281,7 @@
                 <w:color w:val="1F3864"/>
                 <w:sz w:val="16"/>
               </w:rPr>
-              <w:t>Actualización co</w:t>
-            </w:r>
-            <w:r>
-              <w:rPr>
-                <w:rFonts w:ascii="Arial" w:hAnsi="Arial"/>
-                <w:b/>
-                <w:color w:val="1F3864"/>
-                <w:sz w:val="16"/>
-              </w:rPr>
-              <w:t>ntinua / Mensual:</w:t>
+              <w:t>Actualización continua / Mensual:</w:t>
             </w:r>
           </w:p>
           <w:p>
@@ -3490,15 +3326,7 @@
                 <w:color w:val="262626"/>
                 <w:sz w:val="16"/>
               </w:rPr>
-              <w:t>Anual / Semestral (re-estimación de coeficientes con nuevas ondas de EPH-I</w:t>
-            </w:r>
-            <w:r>
-              <w:rPr>
-                <w:rFonts w:ascii="Arial" w:hAnsi="Arial"/>
-                <w:color w:val="262626"/>
-                <w:sz w:val="16"/>
-              </w:rPr>
-              <w:t>NDEC y valorización actualizada de la CBT regional).</w:t>
+              <w:t>Anual / Semestral (re-estimación de coeficientes con nuevas ondas de EPH-INDEC y valorización actualizada de la CBT regional).</w:t>
             </w:r>
           </w:p>
         </w:tc>
@@ -3543,15 +3371,7 @@
                 <w:color w:val="262626"/>
                 <w:sz w:val="16"/>
               </w:rPr>
-              <w:t>• Tipología de hogar: monoparental con jefatura feme</w:t>
-            </w:r>
-            <w:r>
-              <w:rPr>
-                <w:rFonts w:ascii="Arial" w:hAnsi="Arial"/>
-                <w:color w:val="262626"/>
-                <w:sz w:val="16"/>
-              </w:rPr>
-              <w:t>nina, nuclear biparental, extendido, unipersonal.</w:t>
+              <w:t>• Tipología de hogar: monoparental con jefatura femenina, nuclear biparental, extendido, unipersonal.</w:t>
             </w:r>
           </w:p>
           <w:p>
@@ -3590,15 +3410,7 @@
                 <w:color w:val="262626"/>
                 <w:sz w:val="16"/>
               </w:rPr>
-              <w:t>• Calidad habitacional: déficit de saneam</w:t>
-            </w:r>
-            <w:r>
-              <w:rPr>
-                <w:rFonts w:ascii="Arial" w:hAnsi="Arial"/>
-                <w:color w:val="262626"/>
-                <w:sz w:val="16"/>
-              </w:rPr>
-              <w:t>iento, pisos/techos precarios, régimen de tenencia.</w:t>
+              <w:t>• Calidad habitacional: déficit de saneamiento, pisos/techos precarios, régimen de tenencia.</w:t>
             </w:r>
           </w:p>
           <w:p>
@@ -3670,15 +3482,7 @@
                 <w:color w:val="262626"/>
                 <w:sz w:val="16"/>
               </w:rPr>
-              <w:t>• Hogares con jefatura femeni</w:t>
-            </w:r>
-            <w:r>
-              <w:rPr>
-                <w:rFonts w:ascii="Arial" w:hAnsi="Arial"/>
-                <w:color w:val="262626"/>
-                <w:sz w:val="16"/>
-              </w:rPr>
-              <w:t>na y menores a cargo</w:t>
+              <w:t>• Hogares con jefatura femenina y menores a cargo</w:t>
             </w:r>
           </w:p>
           <w:p>
@@ -3719,19 +3523,8 @@
               </w:rPr>
               <w:t>• Distribución de hogares por decil de CPGI (deciles 1 a 10)</w:t>
             </w:r>
-          </w:p>
-          <w:p>
-            <w:pPr>
-              <w:spacing w:before="20" w:after="40" w:line="252" w:lineRule="auto"/>
-            </w:pPr>
-            <w:r>
-              <w:rPr>
-                <w:rFonts w:ascii="Arial" w:hAnsi="Arial"/>
-                <w:color w:val="262626"/>
-                <w:sz w:val="16"/>
-              </w:rPr>
-              <w:t>• Sensibilidad del modelo (≥ 90,2 %) y tasa de error de exclusión (≤ 9,8 %)</w:t>
-            </w:r>
+            <w:bookmarkStart w:id="0" w:name="_GoBack"/>
+            <w:bookmarkEnd w:id="0"/>
           </w:p>
           <w:p>
             <w:pPr>
@@ -3788,15 +3581,20 @@
                 <w:color w:val="262626"/>
                 <w:sz w:val="16"/>
               </w:rPr>
-              <w:t>• Jurisdicciones con tasa de hogares si</w:t>
-            </w:r>
+              <w:t>• Jurisdicciones con tasa de hogares sin empleo registrado superior al percentil 75 nacional.</w:t>
+            </w:r>
+          </w:p>
+          <w:p>
+            <w:pPr>
+              <w:spacing w:before="20" w:after="40" w:line="252" w:lineRule="auto"/>
+            </w:pPr>
             <w:r>
               <w:rPr>
                 <w:rFonts w:ascii="Arial" w:hAnsi="Arial"/>
                 <w:color w:val="262626"/>
                 <w:sz w:val="16"/>
               </w:rPr>
-              <w:t xml:space="preserve">n empleo registrado </w:t>
+              <w:t xml:space="preserve">• Alerta de discrepancia: </w:t>
             </w:r>
             <w:r>
               <w:rPr>
@@ -3805,20 +3603,7 @@
                 <w:sz w:val="16"/>
               </w:rPr>
               <w:lastRenderedPageBreak/>
-              <w:t>superior al percentil 75 nacional.</w:t>
-            </w:r>
-          </w:p>
-          <w:p>
-            <w:pPr>
-              <w:spacing w:before="20" w:after="40" w:line="252" w:lineRule="auto"/>
-            </w:pPr>
-            <w:r>
-              <w:rPr>
-                <w:rFonts w:ascii="Arial" w:hAnsi="Arial"/>
-                <w:color w:val="262626"/>
-                <w:sz w:val="16"/>
-              </w:rPr>
-              <w:t>• Alerta de discrepancia: hogares con CPGI &lt; 1,0 que registran bajas en prestaciones sociales.</w:t>
+              <w:t>hogares con CPGI &lt; 1,0 que registran bajas en prestaciones sociales.</w:t>
             </w:r>
           </w:p>
           <w:p>
@@ -3850,15 +3635,7 @@
                 <w:color w:val="262626"/>
                 <w:sz w:val="16"/>
               </w:rPr>
-              <w:t xml:space="preserve">• Mapa coroplético interactivo: porcentaje de hogares bajo LP (CPGI &lt; 1) por </w:t>
-            </w:r>
-            <w:r>
-              <w:rPr>
-                <w:rFonts w:ascii="Arial" w:hAnsi="Arial"/>
-                <w:color w:val="262626"/>
-                <w:sz w:val="16"/>
-              </w:rPr>
-              <w:t>provincia y departamento.</w:t>
+              <w:t>• Mapa coroplético interactivo: porcentaje de hogares bajo LP (CPGI &lt; 1) por provincia y departamento.</w:t>
             </w:r>
           </w:p>
           <w:p>
@@ -3877,6 +3654,11 @@
           <w:p>
             <w:pPr>
               <w:spacing w:before="20" w:after="40" w:line="252" w:lineRule="auto"/>
+              <w:rPr>
+                <w:rFonts w:ascii="Arial" w:hAnsi="Arial"/>
+                <w:color w:val="262626"/>
+                <w:sz w:val="16"/>
+              </w:rPr>
             </w:pPr>
             <w:r>
               <w:rPr>
@@ -3897,16 +3679,13 @@
                 <w:color w:val="262626"/>
                 <w:sz w:val="16"/>
               </w:rPr>
-              <w:t>• Indicador ti</w:t>
-            </w:r>
-            <w:r>
-              <w:rPr>
-                <w:rFonts w:ascii="Arial" w:hAnsi="Arial"/>
-                <w:color w:val="262626"/>
-                <w:sz w:val="16"/>
-              </w:rPr>
-              <w:t>po velocímetro / semáforo: tasa de sensibilidad y precisión del modelo en monitoreo continuo.</w:t>
-            </w:r>
+              <w:t>. Gráficos de barras: ingreso promedio del hogar</w:t>
+            </w:r>
+          </w:p>
+          <w:p>
+            <w:pPr>
+              <w:spacing w:before="20" w:after="40" w:line="252" w:lineRule="auto"/>
+            </w:pPr>
           </w:p>
         </w:tc>
       </w:tr>
@@ -15838,7 +15617,7 @@
 </file>
 
 <file path=customXml/itemProps1.xml><?xml version="1.0" encoding="utf-8"?>
-<ds:datastoreItem xmlns:ds="http://schemas.openxmlformats.org/officeDocument/2006/customXml" ds:itemID="{EDD11472-EA43-462D-8AB4-40AC746BC24D}">
+<ds:datastoreItem xmlns:ds="http://schemas.openxmlformats.org/officeDocument/2006/customXml" ds:itemID="{E3E2438B-D5AE-4CB8-839D-4940DBEE764D}">
   <ds:schemaRefs>
     <ds:schemaRef ds:uri="http://schemas.openxmlformats.org/officeDocument/2006/bibliography"/>
   </ds:schemaRefs>

</xml_diff>